<commit_message>
more updates and file cleanup
</commit_message>
<xml_diff>
--- a/files/CV.docx
+++ b/files/CV.docx
@@ -770,17 +770,7 @@
                 <w:sz w:val="20"/>
                 <w:szCs w:val="20"/>
               </w:rPr>
-              <w:t>P</w:t>
-            </w:r>
-            <w:r>
-              <w:rPr>
-                <w:rFonts w:ascii="News Gothic MT" w:hAnsi="News Gothic MT" w:cs="Times New Roman"/>
-                <w:b w:val="0"/>
-                <w:bCs/>
-                <w:sz w:val="20"/>
-                <w:szCs w:val="20"/>
-              </w:rPr>
-              <w:t>h.D. Computer Science</w:t>
+              <w:t>Ph.D. Computer Science</w:t>
             </w:r>
           </w:p>
           <w:p>
@@ -889,27 +879,7 @@
                 <w:sz w:val="20"/>
                 <w:szCs w:val="20"/>
               </w:rPr>
-              <w:t>GPA: 3.9</w:t>
-            </w:r>
-            <w:r>
-              <w:rPr>
-                <w:rFonts w:ascii="News Gothic MT" w:hAnsi="News Gothic MT" w:cs="Times New Roman"/>
-                <w:b w:val="0"/>
-                <w:bCs/>
-                <w:sz w:val="20"/>
-                <w:szCs w:val="20"/>
-              </w:rPr>
-              <w:t>7</w:t>
-            </w:r>
-            <w:r>
-              <w:rPr>
-                <w:rFonts w:ascii="News Gothic MT" w:hAnsi="News Gothic MT" w:cs="Times New Roman"/>
-                <w:b w:val="0"/>
-                <w:bCs/>
-                <w:sz w:val="20"/>
-                <w:szCs w:val="20"/>
-              </w:rPr>
-              <w:t>/4.0</w:t>
+              <w:t>GPA: 3.97/4.0</w:t>
             </w:r>
           </w:p>
           <w:p>
@@ -1088,16 +1058,7 @@
                 <w:sz w:val="20"/>
                 <w:szCs w:val="20"/>
               </w:rPr>
-              <w:t xml:space="preserve">    </w:t>
-            </w:r>
-            <w:r>
-              <w:rPr>
-                <w:rFonts w:ascii="News Gothic MT" w:hAnsi="News Gothic MT" w:cs="Times New Roman"/>
-                <w:color w:val="000000" w:themeColor="text1"/>
-                <w:sz w:val="20"/>
-                <w:szCs w:val="20"/>
-              </w:rPr>
-              <w:t>B.A. Computer Science/Music (Flute) double major, minor in Mathematics</w:t>
+              <w:t xml:space="preserve">    B.A. Computer Science/Music (Flute) double major, minor in Mathematics</w:t>
             </w:r>
           </w:p>
           <w:p>
@@ -1117,16 +1078,7 @@
                 <w:sz w:val="20"/>
                 <w:szCs w:val="20"/>
               </w:rPr>
-              <w:t xml:space="preserve">    </w:t>
-            </w:r>
-            <w:r>
-              <w:rPr>
-                <w:rFonts w:ascii="News Gothic MT" w:hAnsi="News Gothic MT" w:cs="Times New Roman"/>
-                <w:color w:val="000000" w:themeColor="text1"/>
-                <w:sz w:val="20"/>
-                <w:szCs w:val="20"/>
-              </w:rPr>
-              <w:t>GPA: 4.0/4.0, Summa Cum Laude, Distinction in Senior Exercises</w:t>
+              <w:t xml:space="preserve">    GPA: 4.0/4.0, Summa Cum Laude, Distinction in Senior Exercises</w:t>
             </w:r>
           </w:p>
           <w:p>
@@ -1325,19 +1277,7 @@
                 <w:sz w:val="20"/>
                 <w:szCs w:val="20"/>
               </w:rPr>
-              <w:t>2018-202</w:t>
-            </w:r>
-            <w:r>
-              <w:rPr>
-                <w:rFonts w:ascii="News Gothic MT" w:hAnsi="News Gothic MT" w:cs="Times New Roman"/>
-                <w:bCs/>
-                <w:i/>
-                <w:iCs/>
-                <w:color w:val="000000" w:themeColor="text1"/>
-                <w:sz w:val="20"/>
-                <w:szCs w:val="20"/>
-              </w:rPr>
-              <w:t>2</w:t>
+              <w:t>2018-2022</w:t>
             </w:r>
           </w:p>
         </w:tc>
@@ -1531,53 +1471,16 @@
                 <w:sz w:val="20"/>
                 <w:szCs w:val="20"/>
               </w:rPr>
-              <w:t>Bjørner</w:t>
-            </w:r>
-            <w:r>
-              <w:rPr>
-                <w:rFonts w:ascii="News Gothic MT" w:hAnsi="News Gothic MT" w:cs="Times New Roman"/>
-                <w:bCs/>
-                <w:color w:val="000000" w:themeColor="text1"/>
-                <w:sz w:val="20"/>
-                <w:szCs w:val="20"/>
-              </w:rPr>
-              <w:t>. “</w:t>
-            </w:r>
-            <w:r>
-              <w:rPr>
-                <w:rFonts w:ascii="News Gothic MT" w:hAnsi="News Gothic MT" w:cs="Times New Roman"/>
-                <w:color w:val="000000" w:themeColor="text1"/>
-                <w:sz w:val="20"/>
-                <w:szCs w:val="20"/>
-              </w:rPr>
-              <w:t xml:space="preserve">Parallelizing SMT </w:t>
-            </w:r>
-            <w:r>
-              <w:rPr>
-                <w:rFonts w:ascii="News Gothic MT" w:hAnsi="News Gothic MT" w:cs="Times New Roman"/>
-                <w:color w:val="000000" w:themeColor="text1"/>
-                <w:sz w:val="20"/>
-                <w:szCs w:val="20"/>
-              </w:rPr>
-              <w:t xml:space="preserve">Solvers </w:t>
-            </w:r>
-            <w:r>
-              <w:rPr>
-                <w:rFonts w:ascii="News Gothic MT" w:hAnsi="News Gothic MT" w:cs="Times New Roman"/>
-                <w:color w:val="000000" w:themeColor="text1"/>
-                <w:sz w:val="20"/>
-                <w:szCs w:val="20"/>
-              </w:rPr>
-              <w:t>via Dynamic Partitioning, Core-Guided Search-Space Pruning, and Online Backbone Detection</w:t>
-            </w:r>
-            <w:r>
-              <w:rPr>
-                <w:rFonts w:ascii="News Gothic MT" w:hAnsi="News Gothic MT" w:cs="Times New Roman"/>
-                <w:color w:val="000000" w:themeColor="text1"/>
-                <w:sz w:val="20"/>
-                <w:szCs w:val="20"/>
-              </w:rPr>
-              <w:t>.” Under review, 2026.</w:t>
+              <w:t>Bjørner. “</w:t>
+            </w:r>
+            <w:r>
+              <w:rPr>
+                <w:rFonts w:ascii="News Gothic MT" w:hAnsi="News Gothic MT" w:cs="Times New Roman"/>
+                <w:color w:val="000000" w:themeColor="text1"/>
+                <w:sz w:val="20"/>
+                <w:szCs w:val="20"/>
+              </w:rPr>
+              <w:t>Parallelizing SMT Solvers via Dynamic Partitioning, Core-Guided Search-Space Pruning, and Online Backbone Detection.” Under review, 2026.</w:t>
             </w:r>
           </w:p>
           <w:p>
@@ -1676,34 +1579,7 @@
                   <w:sz w:val="18"/>
                   <w:szCs w:val="18"/>
                 </w:rPr>
-                <w:t>pa</w:t>
-              </w:r>
-              <w:r>
-                <w:rPr>
-                  <w:rStyle w:val="Hyperlink"/>
-                  <w:rFonts w:ascii="News Gothic MT" w:hAnsi="News Gothic MT" w:cs="Times New Roman"/>
-                  <w:sz w:val="18"/>
-                  <w:szCs w:val="18"/>
-                </w:rPr>
-                <w:t>p</w:t>
-              </w:r>
-              <w:r>
-                <w:rPr>
-                  <w:rStyle w:val="Hyperlink"/>
-                  <w:rFonts w:ascii="News Gothic MT" w:hAnsi="News Gothic MT" w:cs="Times New Roman"/>
-                  <w:sz w:val="18"/>
-                  <w:szCs w:val="18"/>
-                </w:rPr>
-                <w:t>e</w:t>
-              </w:r>
-              <w:r>
-                <w:rPr>
-                  <w:rStyle w:val="Hyperlink"/>
-                  <w:rFonts w:ascii="News Gothic MT" w:hAnsi="News Gothic MT" w:cs="Times New Roman"/>
-                  <w:sz w:val="18"/>
-                  <w:szCs w:val="18"/>
-                </w:rPr>
-                <w:t>r5</w:t>
+                <w:t>paper5</w:t>
               </w:r>
             </w:hyperlink>
             <w:r>
@@ -2036,34 +1912,7 @@
                   <w:sz w:val="18"/>
                   <w:szCs w:val="18"/>
                 </w:rPr>
-                <w:t>pa</w:t>
-              </w:r>
-              <w:r>
-                <w:rPr>
-                  <w:rStyle w:val="Hyperlink"/>
-                  <w:rFonts w:ascii="News Gothic MT" w:hAnsi="News Gothic MT" w:cs="Times New Roman"/>
-                  <w:sz w:val="18"/>
-                  <w:szCs w:val="18"/>
-                </w:rPr>
-                <w:t>p</w:t>
-              </w:r>
-              <w:r>
-                <w:rPr>
-                  <w:rStyle w:val="Hyperlink"/>
-                  <w:rFonts w:ascii="News Gothic MT" w:hAnsi="News Gothic MT" w:cs="Times New Roman"/>
-                  <w:sz w:val="18"/>
-                  <w:szCs w:val="18"/>
-                </w:rPr>
-                <w:t>e</w:t>
-              </w:r>
-              <w:r>
-                <w:rPr>
-                  <w:rStyle w:val="Hyperlink"/>
-                  <w:rFonts w:ascii="News Gothic MT" w:hAnsi="News Gothic MT" w:cs="Times New Roman"/>
-                  <w:sz w:val="18"/>
-                  <w:szCs w:val="18"/>
-                </w:rPr>
-                <w:t>r4</w:t>
+                <w:t>paper4</w:t>
               </w:r>
             </w:hyperlink>
             <w:r>
@@ -2665,16 +2514,7 @@
                 <w:sz w:val="18"/>
                 <w:szCs w:val="18"/>
               </w:rPr>
-              <w:t xml:space="preserve"> </w:t>
-            </w:r>
-            <w:r>
-              <w:rPr>
-                <w:rFonts w:ascii="News Gothic MT" w:hAnsi="News Gothic MT" w:cs="Times New Roman"/>
-                <w:bCs/>
-                <w:sz w:val="18"/>
-                <w:szCs w:val="18"/>
-              </w:rPr>
-              <w:t>[</w:t>
+              <w:t xml:space="preserve"> [</w:t>
             </w:r>
             <w:hyperlink r:id="rId23" w:history="1">
               <w:r>
@@ -2872,40 +2712,7 @@
                   <w:sz w:val="18"/>
                   <w:szCs w:val="18"/>
                 </w:rPr>
-                <w:t>c</w:t>
-              </w:r>
-              <w:r>
-                <w:rPr>
-                  <w:rStyle w:val="Hyperlink"/>
-                  <w:rFonts w:ascii="News Gothic MT" w:hAnsi="News Gothic MT" w:cs="Times New Roman"/>
-                  <w:bCs/>
-                  <w:color w:val="0432FF"/>
-                  <w:sz w:val="18"/>
-                  <w:szCs w:val="18"/>
-                </w:rPr>
-                <w:t>o</w:t>
-              </w:r>
-              <w:r>
-                <w:rPr>
-                  <w:rStyle w:val="Hyperlink"/>
-                  <w:rFonts w:ascii="News Gothic MT" w:hAnsi="News Gothic MT" w:cs="Times New Roman"/>
-                  <w:bCs/>
-                  <w:color w:val="0432FF"/>
-                  <w:sz w:val="18"/>
-                  <w:szCs w:val="18"/>
-                </w:rPr>
-                <w:t>d</w:t>
-              </w:r>
-              <w:r>
-                <w:rPr>
-                  <w:rStyle w:val="Hyperlink"/>
-                  <w:rFonts w:ascii="News Gothic MT" w:hAnsi="News Gothic MT" w:cs="Times New Roman"/>
-                  <w:bCs/>
-                  <w:color w:val="0432FF"/>
-                  <w:sz w:val="18"/>
-                  <w:szCs w:val="18"/>
-                </w:rPr>
-                <w:t>e</w:t>
+                <w:t>code</w:t>
               </w:r>
             </w:hyperlink>
             <w:r>
@@ -3182,16 +2989,7 @@
                 <w:sz w:val="18"/>
                 <w:szCs w:val="18"/>
               </w:rPr>
-              <w:t>domain-specific language</w:t>
-            </w:r>
-            <w:r>
-              <w:rPr>
-                <w:rFonts w:ascii="News Gothic MT" w:hAnsi="News Gothic MT" w:cs="Times New Roman"/>
-                <w:color w:val="000000" w:themeColor="text1"/>
-                <w:sz w:val="18"/>
-                <w:szCs w:val="18"/>
-              </w:rPr>
-              <w:t xml:space="preserve"> bridging the abstraction gap between music theoretical structures and notation. Wrote Haskell-based compiler to </w:t>
+              <w:t xml:space="preserve">domain-specific language bridging the abstraction gap between music theoretical structures and notation. Wrote Haskell-based compiler to </w:t>
             </w:r>
             <w:proofErr w:type="spellStart"/>
             <w:r>
@@ -3726,17 +3524,7 @@
           <w:noProof/>
           <w:color w:val="548DD4" w:themeColor="text2" w:themeTint="99"/>
         </w:rPr>
-        <w:t>REPORTS AND MANUSCRIPT</w:t>
-      </w:r>
-      <w:r>
-        <w:rPr>
-          <w:rFonts w:ascii="News Gothic MT" w:hAnsi="News Gothic MT" w:cs="Times New Roman"/>
-          <w:b/>
-          <w:bCs/>
-          <w:noProof/>
-          <w:color w:val="548DD4" w:themeColor="text2" w:themeTint="99"/>
-        </w:rPr>
-        <w:t>S</w:t>
+        <w:t>REPORTS AND MANUSCRIPTS</w:t>
       </w:r>
     </w:p>
     <w:tbl>
@@ -3924,16 +3712,7 @@
                 <w:sz w:val="20"/>
                 <w:szCs w:val="20"/>
               </w:rPr>
-              <w:t>. “</w:t>
-            </w:r>
-            <w:r>
-              <w:rPr>
-                <w:rFonts w:ascii="News Gothic MT" w:hAnsi="News Gothic MT" w:cs="Times New Roman"/>
-                <w:color w:val="000000" w:themeColor="text1"/>
-                <w:sz w:val="20"/>
-                <w:szCs w:val="20"/>
-              </w:rPr>
-              <w:t xml:space="preserve">Enabling Natural Language </w:t>
+              <w:t xml:space="preserve">. “Enabling Natural Language </w:t>
             </w:r>
             <w:r>
               <w:rPr>
@@ -3951,43 +3730,7 @@
                 <w:sz w:val="20"/>
                 <w:szCs w:val="20"/>
               </w:rPr>
-              <w:t>Dictation in Talon Voice with LLMs</w:t>
-            </w:r>
-            <w:r>
-              <w:rPr>
-                <w:rFonts w:ascii="News Gothic MT" w:hAnsi="News Gothic MT" w:cs="Times New Roman"/>
-                <w:color w:val="000000" w:themeColor="text1"/>
-                <w:sz w:val="20"/>
-                <w:szCs w:val="20"/>
-              </w:rPr>
-              <w:t xml:space="preserve">.” </w:t>
-            </w:r>
-            <w:r>
-              <w:rPr>
-                <w:rFonts w:ascii="News Gothic MT" w:hAnsi="News Gothic MT" w:cs="Times New Roman"/>
-                <w:color w:val="000000" w:themeColor="text1"/>
-                <w:sz w:val="20"/>
-                <w:szCs w:val="20"/>
-              </w:rPr>
-              <w:t>Unpublished manuscript, 202</w:t>
-            </w:r>
-            <w:r>
-              <w:rPr>
-                <w:rFonts w:ascii="News Gothic MT" w:hAnsi="News Gothic MT" w:cs="Times New Roman"/>
-                <w:color w:val="000000" w:themeColor="text1"/>
-                <w:sz w:val="20"/>
-                <w:szCs w:val="20"/>
-              </w:rPr>
-              <w:t>6</w:t>
-            </w:r>
-            <w:r>
-              <w:rPr>
-                <w:rFonts w:ascii="News Gothic MT" w:hAnsi="News Gothic MT" w:cs="Times New Roman"/>
-                <w:color w:val="000000" w:themeColor="text1"/>
-                <w:sz w:val="20"/>
-                <w:szCs w:val="20"/>
-              </w:rPr>
-              <w:t>.</w:t>
+              <w:t>Dictation in Talon Voice with LLMs.” Unpublished manuscript, 2026.</w:t>
             </w:r>
           </w:p>
           <w:p>
@@ -4100,75 +3843,6 @@
               <w:rPr>
                 <w:rFonts w:ascii="News Gothic MT" w:hAnsi="News Gothic MT" w:cs="Times New Roman"/>
                 <w:color w:val="000000" w:themeColor="text1"/>
-                <w:sz w:val="18"/>
-                <w:szCs w:val="18"/>
-              </w:rPr>
-              <w:t>]</w:t>
-            </w:r>
-          </w:p>
-          <w:p>
-            <w:pPr>
-              <w:pStyle w:val="NoSpacing"/>
-              <w:jc w:val="right"/>
-              <w:rPr>
-                <w:rFonts w:ascii="News Gothic MT" w:hAnsi="News Gothic MT" w:cs="Times New Roman"/>
-                <w:bCs/>
-                <w:sz w:val="18"/>
-                <w:szCs w:val="18"/>
-              </w:rPr>
-            </w:pPr>
-            <w:r>
-              <w:rPr>
-                <w:rFonts w:ascii="News Gothic MT" w:hAnsi="News Gothic MT" w:cs="Times New Roman"/>
-                <w:bCs/>
-                <w:sz w:val="18"/>
-                <w:szCs w:val="18"/>
-              </w:rPr>
-              <w:t>[</w:t>
-            </w:r>
-            <w:r>
-              <w:rPr>
-                <w:rFonts w:ascii="News Gothic MT" w:hAnsi="News Gothic MT"/>
-              </w:rPr>
-              <w:fldChar w:fldCharType="begin"/>
-            </w:r>
-            <w:r>
-              <w:rPr>
-                <w:rFonts w:ascii="News Gothic MT" w:hAnsi="News Gothic MT"/>
-              </w:rPr>
-              <w:instrText>HYPERLINK "https://github.com/Z3Prover/z3/blob/master/src/smt/smt_parallel.cpp"</w:instrText>
-            </w:r>
-            <w:r>
-              <w:rPr>
-                <w:rFonts w:ascii="News Gothic MT" w:hAnsi="News Gothic MT"/>
-              </w:rPr>
-            </w:r>
-            <w:r>
-              <w:rPr>
-                <w:rFonts w:ascii="News Gothic MT" w:hAnsi="News Gothic MT"/>
-              </w:rPr>
-              <w:fldChar w:fldCharType="separate"/>
-            </w:r>
-            <w:r>
-              <w:rPr>
-                <w:rStyle w:val="Hyperlink"/>
-                <w:rFonts w:ascii="News Gothic MT" w:hAnsi="News Gothic MT"/>
-                <w:bCs/>
-                <w:sz w:val="18"/>
-                <w:szCs w:val="18"/>
-              </w:rPr>
-              <w:t>code</w:t>
-            </w:r>
-            <w:r>
-              <w:rPr>
-                <w:rFonts w:ascii="News Gothic MT" w:hAnsi="News Gothic MT"/>
-              </w:rPr>
-              <w:fldChar w:fldCharType="end"/>
-            </w:r>
-            <w:r>
-              <w:rPr>
-                <w:rFonts w:ascii="News Gothic MT" w:hAnsi="News Gothic MT" w:cs="Times New Roman"/>
-                <w:bCs/>
                 <w:sz w:val="18"/>
                 <w:szCs w:val="18"/>
               </w:rPr>
@@ -4298,27 +3972,7 @@
                 <w:sz w:val="20"/>
                 <w:szCs w:val="20"/>
               </w:rPr>
-              <w:t>) Team, Microsoft Research. “</w:t>
-            </w:r>
-            <w:r>
-              <w:rPr>
-                <w:rFonts w:ascii="News Gothic MT" w:hAnsi="News Gothic MT" w:cs="Times New Roman"/>
-                <w:bCs/>
-                <w:color w:val="000000" w:themeColor="text1"/>
-                <w:sz w:val="20"/>
-                <w:szCs w:val="20"/>
-              </w:rPr>
-              <w:t>Training LLMs for Verified Programming</w:t>
-            </w:r>
-            <w:r>
-              <w:rPr>
-                <w:rFonts w:ascii="News Gothic MT" w:hAnsi="News Gothic MT" w:cs="Times New Roman"/>
-                <w:bCs/>
-                <w:color w:val="000000" w:themeColor="text1"/>
-                <w:sz w:val="20"/>
-                <w:szCs w:val="20"/>
-              </w:rPr>
-              <w:t>.” Internship project, summer 2026.</w:t>
+              <w:t>) Team, Microsoft Research. “Training LLMs for Verified Programming.” Internship project, summer 2026.</w:t>
             </w:r>
           </w:p>
           <w:p>
@@ -5144,16 +4798,7 @@
                 <w:sz w:val="18"/>
                 <w:szCs w:val="18"/>
               </w:rPr>
-              <w:t xml:space="preserve"> </w:t>
-            </w:r>
-            <w:r>
-              <w:rPr>
-                <w:rFonts w:ascii="News Gothic MT" w:hAnsi="News Gothic MT"/>
-                <w:color w:val="000000" w:themeColor="text1"/>
-                <w:sz w:val="18"/>
-                <w:szCs w:val="18"/>
-              </w:rPr>
-              <w:t>[</w:t>
+              <w:t xml:space="preserve"> [</w:t>
             </w:r>
             <w:hyperlink r:id="rId40" w:history="1">
               <w:r>
@@ -5398,43 +5043,7 @@
                   <w:sz w:val="18"/>
                   <w:szCs w:val="18"/>
                 </w:rPr>
-                <w:t>rep</w:t>
-              </w:r>
-              <w:r>
-                <w:rPr>
-                  <w:rStyle w:val="Hyperlink"/>
-                  <w:rFonts w:ascii="News Gothic MT" w:hAnsi="News Gothic MT" w:cs="Times New Roman"/>
-                  <w:sz w:val="18"/>
-                  <w:szCs w:val="18"/>
-                </w:rPr>
-                <w:t>o</w:t>
-              </w:r>
-              <w:r>
-                <w:rPr>
-                  <w:rStyle w:val="Hyperlink"/>
-                  <w:rFonts w:ascii="News Gothic MT" w:hAnsi="News Gothic MT" w:cs="Times New Roman"/>
-                  <w:sz w:val="18"/>
-                  <w:szCs w:val="18"/>
-                </w:rPr>
-                <w:t>r</w:t>
-              </w:r>
-              <w:r>
-                <w:rPr>
-                  <w:rStyle w:val="Hyperlink"/>
-                  <w:rFonts w:ascii="News Gothic MT" w:hAnsi="News Gothic MT" w:cs="Times New Roman"/>
-                  <w:sz w:val="18"/>
-                  <w:szCs w:val="18"/>
-                </w:rPr>
-                <w:t>t</w:t>
-              </w:r>
-              <w:r>
-                <w:rPr>
-                  <w:rStyle w:val="Hyperlink"/>
-                  <w:rFonts w:ascii="News Gothic MT" w:hAnsi="News Gothic MT" w:cs="Times New Roman"/>
-                  <w:sz w:val="18"/>
-                  <w:szCs w:val="18"/>
-                </w:rPr>
-                <w:t>1</w:t>
+                <w:t>report1</w:t>
               </w:r>
             </w:hyperlink>
             <w:r>
@@ -5988,25 +5597,7 @@
                 <w:sz w:val="20"/>
                 <w:szCs w:val="20"/>
               </w:rPr>
-              <w:t>automatically generates production-ready</w:t>
-            </w:r>
-            <w:r>
-              <w:rPr>
-                <w:rFonts w:ascii="News Gothic MT" w:eastAsiaTheme="minorHAnsi" w:hAnsi="News Gothic MT" w:cs="Times New Roman"/>
-                <w:b w:val="0"/>
-                <w:sz w:val="20"/>
-                <w:szCs w:val="20"/>
-              </w:rPr>
-              <w:t xml:space="preserve"> </w:t>
-            </w:r>
-            <w:r>
-              <w:rPr>
-                <w:rFonts w:ascii="News Gothic MT" w:eastAsiaTheme="minorHAnsi" w:hAnsi="News Gothic MT" w:cs="Times New Roman"/>
-                <w:b w:val="0"/>
-                <w:sz w:val="20"/>
-                <w:szCs w:val="20"/>
-              </w:rPr>
-              <w:t xml:space="preserve">SDKs from </w:t>
+              <w:t xml:space="preserve">automatically generates production-ready SDKs from </w:t>
             </w:r>
             <w:proofErr w:type="spellStart"/>
             <w:r>
@@ -6207,15 +5798,7 @@
                 <w:sz w:val="20"/>
                 <w:szCs w:val="20"/>
               </w:rPr>
-              <w:t>Software Engineer, Met</w:t>
-            </w:r>
-            <w:r>
-              <w:rPr>
-                <w:rFonts w:ascii="News Gothic MT" w:hAnsi="News Gothic MT" w:cs="Times New Roman"/>
-                <w:sz w:val="20"/>
-                <w:szCs w:val="20"/>
-              </w:rPr>
-              <w:t>a</w:t>
+              <w:t>Software Engineer, Meta</w:t>
             </w:r>
             <w:r>
               <w:rPr>
@@ -6823,18 +6406,7 @@
                 <w:sz w:val="20"/>
                 <w:szCs w:val="20"/>
               </w:rPr>
-              <w:t>Teaching Assistant, CS 133: Database Systems, Pomona College</w:t>
-            </w:r>
-            <w:r>
-              <w:rPr>
-                <w:rFonts w:ascii="News Gothic MT" w:hAnsi="News Gothic MT" w:cs="Times New Roman"/>
-                <w:b/>
-                <w:bCs/>
-                <w:color w:val="000000" w:themeColor="text1"/>
-                <w:sz w:val="20"/>
-                <w:szCs w:val="20"/>
-              </w:rPr>
-              <w:t xml:space="preserve"> </w:t>
+              <w:t xml:space="preserve">Teaching Assistant, CS 133: Database Systems, Pomona College </w:t>
             </w:r>
             <w:r>
               <w:rPr>
@@ -7058,18 +6630,7 @@
                 <w:sz w:val="20"/>
                 <w:szCs w:val="20"/>
               </w:rPr>
-              <w:t>Programming Systems Group, UC San Diego</w:t>
-            </w:r>
-            <w:r>
-              <w:rPr>
-                <w:rFonts w:ascii="News Gothic MT" w:hAnsi="News Gothic MT"/>
-                <w:i/>
-                <w:iCs/>
-                <w:color w:val="000000" w:themeColor="text1"/>
-                <w:sz w:val="20"/>
-                <w:szCs w:val="20"/>
-              </w:rPr>
-              <w:t>.</w:t>
+              <w:t>Programming Systems Group, UC San Diego.</w:t>
             </w:r>
           </w:p>
           <w:p>
@@ -7148,18 +6709,7 @@
                 <w:sz w:val="20"/>
                 <w:szCs w:val="20"/>
               </w:rPr>
-              <w:t>Programming Systems Group, UC San Diego</w:t>
-            </w:r>
-            <w:r>
-              <w:rPr>
-                <w:rFonts w:ascii="News Gothic MT" w:hAnsi="News Gothic MT"/>
-                <w:i/>
-                <w:iCs/>
-                <w:color w:val="000000" w:themeColor="text1"/>
-                <w:sz w:val="20"/>
-                <w:szCs w:val="20"/>
-              </w:rPr>
-              <w:t>.</w:t>
+              <w:t>Programming Systems Group, UC San Diego.</w:t>
             </w:r>
           </w:p>
           <w:p>
@@ -7378,18 +6928,7 @@
                 <w:sz w:val="20"/>
                 <w:szCs w:val="20"/>
               </w:rPr>
-              <w:t xml:space="preserve"> PLS</w:t>
-            </w:r>
-            <w:r>
-              <w:rPr>
-                <w:rFonts w:ascii="News Gothic MT" w:hAnsi="News Gothic MT"/>
-                <w:i/>
-                <w:iCs/>
-                <w:color w:val="000000" w:themeColor="text1"/>
-                <w:sz w:val="20"/>
-                <w:szCs w:val="20"/>
-              </w:rPr>
-              <w:t>).</w:t>
+              <w:t xml:space="preserve"> PLS).</w:t>
             </w:r>
           </w:p>
           <w:p>
@@ -7582,18 +7121,7 @@
                 <w:sz w:val="20"/>
                 <w:szCs w:val="20"/>
               </w:rPr>
-              <w:t>International Conference on Technologies for Music Notation and Representation</w:t>
-            </w:r>
-            <w:r>
-              <w:rPr>
-                <w:rFonts w:ascii="News Gothic MT" w:hAnsi="News Gothic MT" w:cs="Times New Roman"/>
-                <w:i/>
-                <w:iCs/>
-                <w:color w:val="000000" w:themeColor="text1"/>
-                <w:sz w:val="20"/>
-                <w:szCs w:val="20"/>
-              </w:rPr>
-              <w:t>.</w:t>
+              <w:t>International Conference on Technologies for Music Notation and Representation.</w:t>
             </w:r>
           </w:p>
         </w:tc>
@@ -8069,31 +7597,7 @@
                 <w:sz w:val="20"/>
                 <w:szCs w:val="20"/>
               </w:rPr>
-              <w:t>20</w:t>
-            </w:r>
-            <w:r>
-              <w:rPr>
-                <w:rFonts w:ascii="News Gothic MT" w:hAnsi="News Gothic MT" w:cs="Times New Roman"/>
-                <w:b w:val="0"/>
-                <w:bCs/>
-                <w:i/>
-                <w:iCs/>
-                <w:sz w:val="20"/>
-                <w:szCs w:val="20"/>
-              </w:rPr>
-              <w:t>2</w:t>
-            </w:r>
-            <w:r>
-              <w:rPr>
-                <w:rFonts w:ascii="News Gothic MT" w:hAnsi="News Gothic MT" w:cs="Times New Roman"/>
-                <w:b w:val="0"/>
-                <w:bCs/>
-                <w:i/>
-                <w:iCs/>
-                <w:sz w:val="20"/>
-                <w:szCs w:val="20"/>
-              </w:rPr>
-              <w:t>2</w:t>
+              <w:t>2022</w:t>
             </w:r>
           </w:p>
         </w:tc>
@@ -8526,29 +8030,7 @@
                 <w:sz w:val="20"/>
                 <w:szCs w:val="20"/>
               </w:rPr>
-              <w:t>The William F. Russell Priz</w:t>
-            </w:r>
-            <w:r>
-              <w:rPr>
-                <w:rFonts w:ascii="News Gothic MT" w:hAnsi="News Gothic MT" w:cs="Times New Roman"/>
-                <w:b/>
-                <w:bCs/>
-                <w:color w:val="000000" w:themeColor="text1"/>
-                <w:sz w:val="20"/>
-                <w:szCs w:val="20"/>
-              </w:rPr>
-              <w:t>e</w:t>
-            </w:r>
-            <w:r>
-              <w:rPr>
-                <w:rFonts w:ascii="News Gothic MT" w:hAnsi="News Gothic MT" w:cs="Times New Roman"/>
-                <w:b/>
-                <w:bCs/>
-                <w:color w:val="000000" w:themeColor="text1"/>
-                <w:sz w:val="20"/>
-                <w:szCs w:val="20"/>
-              </w:rPr>
-              <w:t xml:space="preserve">   </w:t>
+              <w:t xml:space="preserve">The William F. Russell Prize   </w:t>
             </w:r>
           </w:p>
           <w:p>

</xml_diff>